<commit_message>
ENTRYPOINT vs CMD and IAM - Console, CLI, SDK - Usage
</commit_message>
<xml_diff>
--- a/Interview Question.docx
+++ b/Interview Question.docx
@@ -564,15 +564,7 @@
         </w:numPr>
       </w:pPr>
       <w:r>
-        <w:t xml:space="preserve">Create a directory named </w:t>
-      </w:r>
-      <w:proofErr w:type="spellStart"/>
-      <w:r>
-        <w:t>myapp</w:t>
-      </w:r>
-      <w:proofErr w:type="spellEnd"/>
-      <w:r>
-        <w:t xml:space="preserve"> and add a simple Python script (app.py):</w:t>
+        <w:t>Create a directory named myapp and add a simple Python script (app.py):</w:t>
       </w:r>
     </w:p>
     <w:p>
@@ -590,17 +582,7 @@
         <w:ind w:left="1440"/>
       </w:pPr>
       <w:r>
-        <w:t xml:space="preserve"># </w:t>
-      </w:r>
-      <w:proofErr w:type="spellStart"/>
-      <w:proofErr w:type="gramStart"/>
-      <w:r>
-        <w:t>sys.argv</w:t>
-      </w:r>
-      <w:proofErr w:type="spellEnd"/>
-      <w:proofErr w:type="gramEnd"/>
-      <w:r>
-        <w:t>[1] captures the first argument passed to the script</w:t>
+        <w:t># sys.argv[1] captures the first argument passed to the script</w:t>
       </w:r>
     </w:p>
     <w:p>
@@ -609,25 +591,7 @@
         <w:ind w:left="1440"/>
       </w:pPr>
       <w:r>
-        <w:t xml:space="preserve">if </w:t>
-      </w:r>
-      <w:proofErr w:type="spellStart"/>
-      <w:r>
-        <w:t>len</w:t>
-      </w:r>
-      <w:proofErr w:type="spellEnd"/>
-      <w:r>
-        <w:t>(</w:t>
-      </w:r>
-      <w:proofErr w:type="spellStart"/>
-      <w:proofErr w:type="gramStart"/>
-      <w:r>
-        <w:t>sys.argv</w:t>
-      </w:r>
-      <w:proofErr w:type="spellEnd"/>
-      <w:proofErr w:type="gramEnd"/>
-      <w:r>
-        <w:t>) &gt; 1:</w:t>
+        <w:t>if len(sys.argv) &gt; 1:</w:t>
       </w:r>
     </w:p>
     <w:p>
@@ -635,28 +599,8 @@
         <w:pStyle w:val="ListParagraph"/>
         <w:ind w:left="1440"/>
       </w:pPr>
-      <w:proofErr w:type="gramStart"/>
-      <w:r>
-        <w:t>print(</w:t>
-      </w:r>
-      <w:proofErr w:type="spellStart"/>
-      <w:proofErr w:type="gramEnd"/>
-      <w:r>
-        <w:t>f"Hello</w:t>
-      </w:r>
-      <w:proofErr w:type="spellEnd"/>
-      <w:r>
-        <w:t>, {</w:t>
-      </w:r>
-      <w:proofErr w:type="spellStart"/>
-      <w:proofErr w:type="gramStart"/>
-      <w:r>
-        <w:t>sys.argv</w:t>
-      </w:r>
-      <w:proofErr w:type="spellEnd"/>
-      <w:proofErr w:type="gramEnd"/>
-      <w:r>
-        <w:t>[1]}! This is your container speaking.")</w:t>
+      <w:r>
+        <w:t>print(f"Hello, {sys.argv[1]}! This is your container speaking.")</w:t>
       </w:r>
     </w:p>
     <w:p>
@@ -673,13 +617,8 @@
         <w:pStyle w:val="ListParagraph"/>
         <w:ind w:left="1440"/>
       </w:pPr>
-      <w:proofErr w:type="gramStart"/>
-      <w:r>
-        <w:t>print(</w:t>
-      </w:r>
-      <w:proofErr w:type="gramEnd"/>
-      <w:r>
-        <w:t>"Hello! You didn't provide a name.")</w:t>
+      <w:r>
+        <w:t>print("Hello! You didn't provide a name.")</w:t>
       </w:r>
     </w:p>
     <w:p>
@@ -699,17 +638,8 @@
           <w:b/>
           <w:bCs/>
         </w:rPr>
-        <w:t xml:space="preserve">Define the </w:t>
-      </w:r>
-      <w:proofErr w:type="spellStart"/>
-      <w:r>
-        <w:rPr>
-          <w:b/>
-          <w:bCs/>
-        </w:rPr>
-        <w:t>Dockerfile</w:t>
-      </w:r>
-      <w:proofErr w:type="spellEnd"/>
+        <w:t>Define the Dockerfile</w:t>
+      </w:r>
     </w:p>
     <w:p>
       <w:pPr>
@@ -724,13 +654,8 @@
         </w:rPr>
       </w:pPr>
       <w:r>
-        <w:t xml:space="preserve">In the same folder, create a </w:t>
-      </w:r>
-      <w:proofErr w:type="spellStart"/>
-      <w:r>
-        <w:t>Dockerfile:</w:t>
-      </w:r>
-      <w:proofErr w:type="spellEnd"/>
+        <w:t>In the same folder, create a Dockerfile:</w:t>
+      </w:r>
     </w:p>
     <w:p>
       <w:pPr>
@@ -756,13 +681,8 @@
         <w:ind w:left="1440"/>
       </w:pPr>
       <w:r>
-        <w:t xml:space="preserve">COPY </w:t>
-      </w:r>
-      <w:proofErr w:type="gramStart"/>
-      <w:r>
-        <w:t>app.py .</w:t>
-      </w:r>
-      <w:proofErr w:type="gramEnd"/>
+        <w:t>COPY app.py .</w:t>
+      </w:r>
     </w:p>
     <w:p>
       <w:pPr>
@@ -833,15 +753,7 @@
         </w:rPr>
       </w:pPr>
       <w:r>
-        <w:t xml:space="preserve">Open your terminal inside the </w:t>
-      </w:r>
-      <w:proofErr w:type="spellStart"/>
-      <w:r>
-        <w:t>myapp</w:t>
-      </w:r>
-      <w:proofErr w:type="spellEnd"/>
-      <w:r>
-        <w:t xml:space="preserve"> folder and build the image:</w:t>
+        <w:t>Open your terminal inside the myapp folder and build the image:</w:t>
       </w:r>
     </w:p>
     <w:p>
@@ -854,13 +766,8 @@
         </w:rPr>
       </w:pPr>
       <w:r>
-        <w:t>docker build -t my-greeting-</w:t>
-      </w:r>
-      <w:proofErr w:type="gramStart"/>
-      <w:r>
-        <w:t>tool .</w:t>
-      </w:r>
-      <w:proofErr w:type="gramEnd"/>
+        <w:t>docker build -t my-greeting-tool .</w:t>
+      </w:r>
     </w:p>
     <w:p>
       <w:pPr>
@@ -1087,15 +994,7 @@
         </w:numPr>
       </w:pPr>
       <w:r>
-        <w:t xml:space="preserve">If you are a complete </w:t>
-      </w:r>
-      <w:proofErr w:type="gramStart"/>
-      <w:r>
-        <w:t>beginner</w:t>
-      </w:r>
-      <w:proofErr w:type="gramEnd"/>
-      <w:r>
-        <w:t xml:space="preserve"> then follow the below steps in the Visual Studio Code:</w:t>
+        <w:t>If you are a complete beginner then follow the below steps in the Visual Studio Code:</w:t>
       </w:r>
     </w:p>
     <w:p>
@@ -1131,49 +1030,31 @@
         </w:numPr>
       </w:pPr>
       <w:r>
-        <w:t xml:space="preserve">Create a new folder named </w:t>
-      </w:r>
-      <w:proofErr w:type="spellStart"/>
-      <w:r>
-        <w:t>DockerTest</w:t>
-      </w:r>
-      <w:proofErr w:type="spellEnd"/>
-    </w:p>
-    <w:p>
-      <w:pPr>
-        <w:pStyle w:val="ListParagraph"/>
-        <w:numPr>
-          <w:ilvl w:val="0"/>
-          <w:numId w:val="1"/>
-        </w:numPr>
-      </w:pPr>
-      <w:r>
-        <w:t xml:space="preserve">inside this folder create a new folder </w:t>
-      </w:r>
-      <w:proofErr w:type="spellStart"/>
-      <w:r>
-        <w:t>myapp</w:t>
-      </w:r>
-      <w:proofErr w:type="spellEnd"/>
-    </w:p>
-    <w:p>
-      <w:pPr>
-        <w:pStyle w:val="ListParagraph"/>
-        <w:numPr>
-          <w:ilvl w:val="0"/>
-          <w:numId w:val="1"/>
-        </w:numPr>
-      </w:pPr>
-      <w:r>
-        <w:t xml:space="preserve">add a new app.py file in this </w:t>
-      </w:r>
-      <w:proofErr w:type="spellStart"/>
-      <w:r>
-        <w:t>myapp</w:t>
-      </w:r>
-      <w:proofErr w:type="spellEnd"/>
-      <w:r>
-        <w:t xml:space="preserve"> folder</w:t>
+        <w:t>Create a new folder named DockerTest</w:t>
+      </w:r>
+    </w:p>
+    <w:p>
+      <w:pPr>
+        <w:pStyle w:val="ListParagraph"/>
+        <w:numPr>
+          <w:ilvl w:val="0"/>
+          <w:numId w:val="1"/>
+        </w:numPr>
+      </w:pPr>
+      <w:r>
+        <w:t>inside this folder create a new folder myapp</w:t>
+      </w:r>
+    </w:p>
+    <w:p>
+      <w:pPr>
+        <w:pStyle w:val="ListParagraph"/>
+        <w:numPr>
+          <w:ilvl w:val="0"/>
+          <w:numId w:val="1"/>
+        </w:numPr>
+      </w:pPr>
+      <w:r>
+        <w:t>add a new app.py file in this myapp folder</w:t>
       </w:r>
     </w:p>
     <w:p>
@@ -1221,92 +1102,31 @@
         </w:numPr>
       </w:pPr>
       <w:r>
-        <w:t xml:space="preserve"># </w:t>
-      </w:r>
-      <w:proofErr w:type="spellStart"/>
-      <w:proofErr w:type="gramStart"/>
-      <w:r>
-        <w:t>sys.argv</w:t>
-      </w:r>
-      <w:proofErr w:type="spellEnd"/>
-      <w:proofErr w:type="gramEnd"/>
-      <w:r>
-        <w:t xml:space="preserve">[0] is the script name, </w:t>
-      </w:r>
-      <w:proofErr w:type="spellStart"/>
-      <w:proofErr w:type="gramStart"/>
-      <w:r>
-        <w:t>sys.argv</w:t>
-      </w:r>
-      <w:proofErr w:type="spellEnd"/>
-      <w:proofErr w:type="gramEnd"/>
-      <w:r>
-        <w:t>[1] is the first argument</w:t>
-      </w:r>
-    </w:p>
-    <w:p>
-      <w:pPr>
-        <w:pStyle w:val="ListParagraph"/>
-        <w:numPr>
-          <w:ilvl w:val="0"/>
-          <w:numId w:val="1"/>
-        </w:numPr>
-      </w:pPr>
-      <w:r>
-        <w:t xml:space="preserve">if </w:t>
-      </w:r>
-      <w:proofErr w:type="spellStart"/>
-      <w:r>
-        <w:t>len</w:t>
-      </w:r>
-      <w:proofErr w:type="spellEnd"/>
-      <w:r>
-        <w:t>(</w:t>
-      </w:r>
-      <w:proofErr w:type="spellStart"/>
-      <w:proofErr w:type="gramStart"/>
-      <w:r>
-        <w:t>sys.argv</w:t>
-      </w:r>
-      <w:proofErr w:type="spellEnd"/>
-      <w:proofErr w:type="gramEnd"/>
-      <w:r>
-        <w:t>) &gt; 1:</w:t>
-      </w:r>
-    </w:p>
-    <w:p>
-      <w:pPr>
-        <w:pStyle w:val="ListParagraph"/>
-        <w:numPr>
-          <w:ilvl w:val="0"/>
-          <w:numId w:val="1"/>
-        </w:numPr>
-      </w:pPr>
-      <w:r>
-        <w:t xml:space="preserve">    </w:t>
-      </w:r>
-      <w:proofErr w:type="gramStart"/>
-      <w:r>
-        <w:t>print(</w:t>
-      </w:r>
-      <w:proofErr w:type="spellStart"/>
-      <w:proofErr w:type="gramEnd"/>
-      <w:r>
-        <w:t>f"Hello</w:t>
-      </w:r>
-      <w:proofErr w:type="spellEnd"/>
-      <w:r>
-        <w:t>, {</w:t>
-      </w:r>
-      <w:proofErr w:type="spellStart"/>
-      <w:proofErr w:type="gramStart"/>
-      <w:r>
-        <w:t>sys.argv</w:t>
-      </w:r>
-      <w:proofErr w:type="spellEnd"/>
-      <w:proofErr w:type="gramEnd"/>
-      <w:r>
-        <w:t>[1]}! This is your container speaking.")</w:t>
+        <w:t># sys.argv[0] is the script name, sys.argv[1] is the first argument</w:t>
+      </w:r>
+    </w:p>
+    <w:p>
+      <w:pPr>
+        <w:pStyle w:val="ListParagraph"/>
+        <w:numPr>
+          <w:ilvl w:val="0"/>
+          <w:numId w:val="1"/>
+        </w:numPr>
+      </w:pPr>
+      <w:r>
+        <w:t>if len(sys.argv) &gt; 1:</w:t>
+      </w:r>
+    </w:p>
+    <w:p>
+      <w:pPr>
+        <w:pStyle w:val="ListParagraph"/>
+        <w:numPr>
+          <w:ilvl w:val="0"/>
+          <w:numId w:val="1"/>
+        </w:numPr>
+      </w:pPr>
+      <w:r>
+        <w:t xml:space="preserve">    print(f"Hello, {sys.argv[1]}! This is your container speaking.")</w:t>
       </w:r>
     </w:p>
     <w:p>
@@ -1330,15 +1150,7 @@
         </w:numPr>
       </w:pPr>
       <w:r>
-        <w:t xml:space="preserve">    </w:t>
-      </w:r>
-      <w:proofErr w:type="gramStart"/>
-      <w:r>
-        <w:t>print(</w:t>
-      </w:r>
-      <w:proofErr w:type="gramEnd"/>
-      <w:r>
-        <w:t xml:space="preserve">"Hello! You didn't provide a name.") </w:t>
+        <w:t xml:space="preserve">    print("Hello! You didn't provide a name.") </w:t>
       </w:r>
     </w:p>
     <w:p>
@@ -1362,40 +1174,19 @@
         </w:numPr>
       </w:pPr>
       <w:r>
-        <w:t xml:space="preserve">Now in the same </w:t>
-      </w:r>
-      <w:proofErr w:type="spellStart"/>
-      <w:r>
-        <w:t>myapp</w:t>
-      </w:r>
-      <w:proofErr w:type="spellEnd"/>
-      <w:r>
-        <w:t xml:space="preserve"> folder create a new file named </w:t>
-      </w:r>
-      <w:proofErr w:type="spellStart"/>
-      <w:r>
-        <w:t>Dockerfile</w:t>
-      </w:r>
-      <w:proofErr w:type="spellEnd"/>
-    </w:p>
-    <w:p>
-      <w:pPr>
-        <w:pStyle w:val="ListParagraph"/>
-        <w:numPr>
-          <w:ilvl w:val="0"/>
-          <w:numId w:val="1"/>
-        </w:numPr>
-      </w:pPr>
-      <w:r>
-        <w:t xml:space="preserve">Write the below code into the </w:t>
-      </w:r>
-      <w:proofErr w:type="spellStart"/>
-      <w:r>
-        <w:t>Dockerfile</w:t>
-      </w:r>
-      <w:proofErr w:type="spellEnd"/>
-      <w:r>
-        <w:t xml:space="preserve"> created</w:t>
+        <w:t>Now in the same myapp folder create a new file named Dockerfile</w:t>
+      </w:r>
+    </w:p>
+    <w:p>
+      <w:pPr>
+        <w:pStyle w:val="ListParagraph"/>
+        <w:numPr>
+          <w:ilvl w:val="0"/>
+          <w:numId w:val="1"/>
+        </w:numPr>
+      </w:pPr>
+      <w:r>
+        <w:t>Write the below code into the Dockerfile created</w:t>
       </w:r>
     </w:p>
     <w:p>
@@ -1443,13 +1234,8 @@
         </w:numPr>
       </w:pPr>
       <w:r>
-        <w:t xml:space="preserve">COPY </w:t>
-      </w:r>
-      <w:proofErr w:type="gramStart"/>
-      <w:r>
-        <w:t>app.py .</w:t>
-      </w:r>
-      <w:proofErr w:type="gramEnd"/>
+        <w:t>COPY app.py .</w:t>
+      </w:r>
     </w:p>
     <w:p>
       <w:pPr>
@@ -1520,43 +1306,19 @@
         </w:numPr>
       </w:pPr>
       <w:r>
-        <w:t xml:space="preserve">Now open the VS terminal and </w:t>
-      </w:r>
-      <w:proofErr w:type="spellStart"/>
-      <w:r>
-        <w:t>nacvigate</w:t>
-      </w:r>
-      <w:proofErr w:type="spellEnd"/>
-      <w:r>
-        <w:t xml:space="preserve"> to inside </w:t>
-      </w:r>
-      <w:proofErr w:type="spellStart"/>
-      <w:r>
-        <w:t>myapp</w:t>
-      </w:r>
-      <w:proofErr w:type="spellEnd"/>
-      <w:r>
-        <w:t xml:space="preserve"> folder</w:t>
-      </w:r>
-    </w:p>
-    <w:p>
-      <w:pPr>
-        <w:pStyle w:val="ListParagraph"/>
-        <w:numPr>
-          <w:ilvl w:val="0"/>
-          <w:numId w:val="1"/>
-        </w:numPr>
-      </w:pPr>
-      <w:r>
-        <w:t>type and run the command "docker build -t my-greeting-</w:t>
-      </w:r>
-      <w:proofErr w:type="gramStart"/>
-      <w:r>
-        <w:t>tool .</w:t>
-      </w:r>
-      <w:proofErr w:type="gramEnd"/>
-      <w:r>
-        <w:t>"</w:t>
+        <w:t>Now open the VS terminal and nacvigate to inside myapp folder</w:t>
+      </w:r>
+    </w:p>
+    <w:p>
+      <w:pPr>
+        <w:pStyle w:val="ListParagraph"/>
+        <w:numPr>
+          <w:ilvl w:val="0"/>
+          <w:numId w:val="1"/>
+        </w:numPr>
+      </w:pPr>
+      <w:r>
+        <w:t>type and run the command "docker build -t my-greeting-tool ."</w:t>
       </w:r>
     </w:p>
     <w:p>
@@ -1749,32 +1511,19 @@
         </w:numPr>
       </w:pPr>
       <w:r>
-        <w:t xml:space="preserve">docker has some input argument Praveen to take care of so this will execute what is in the execute part and overrides CMD in the </w:t>
-      </w:r>
-      <w:proofErr w:type="spellStart"/>
-      <w:r>
-        <w:t>Dockerfile</w:t>
-      </w:r>
-      <w:proofErr w:type="spellEnd"/>
-      <w:r>
-        <w:t xml:space="preserve"> code</w:t>
-      </w:r>
-    </w:p>
-    <w:p>
-      <w:pPr>
-        <w:pStyle w:val="ListParagraph"/>
-        <w:numPr>
-          <w:ilvl w:val="0"/>
-          <w:numId w:val="1"/>
-        </w:numPr>
-      </w:pPr>
-      <w:proofErr w:type="gramStart"/>
-      <w:r>
-        <w:t>So</w:t>
-      </w:r>
-      <w:proofErr w:type="gramEnd"/>
-      <w:r>
-        <w:t xml:space="preserve"> this is what the difference between ENTRYPOINT and CMD</w:t>
+        <w:t>docker has some input argument Praveen to take care of so this will execute what is in the execute part and overrides CMD in the Dockerfile code</w:t>
+      </w:r>
+    </w:p>
+    <w:p>
+      <w:pPr>
+        <w:pStyle w:val="ListParagraph"/>
+        <w:numPr>
+          <w:ilvl w:val="0"/>
+          <w:numId w:val="1"/>
+        </w:numPr>
+      </w:pPr>
+      <w:r>
+        <w:t>So this is what the difference between ENTRYPOINT and CMD</w:t>
       </w:r>
     </w:p>
     <w:p>
@@ -1782,7 +1531,13 @@
         <w:pStyle w:val="Heading2"/>
       </w:pPr>
       <w:r>
-        <w:t>Explain difference between Console, SDK, CLI related to AWS IAM</w:t>
+        <w:t xml:space="preserve">Explain </w:t>
+      </w:r>
+      <w:r>
+        <w:t>usage</w:t>
+      </w:r>
+      <w:r>
+        <w:t xml:space="preserve"> Console, SDK, CLI related to AWS IAM</w:t>
       </w:r>
     </w:p>
     <w:p>
@@ -1939,15 +1694,7 @@
     </w:p>
     <w:p>
       <w:r>
-        <w:t xml:space="preserve">The CLI is a unified tool that allows you to manage IAM services from your terminal or command prompt (e.g., Bash, </w:t>
-      </w:r>
-      <w:proofErr w:type="spellStart"/>
-      <w:r>
-        <w:t>Zsh</w:t>
-      </w:r>
-      <w:proofErr w:type="spellEnd"/>
-      <w:r>
-        <w:t>, or PowerShell).</w:t>
+        <w:t>The CLI is a unified tool that allows you to manage IAM services from your terminal or command prompt (e.g., Bash, Zsh, or PowerShell).</w:t>
       </w:r>
     </w:p>
     <w:p>
@@ -2012,21 +1759,8 @@
       </w:r>
     </w:p>
     <w:p>
-      <w:proofErr w:type="spellStart"/>
-      <w:r>
-        <w:t>aws</w:t>
-      </w:r>
-      <w:proofErr w:type="spellEnd"/>
-      <w:r>
-        <w:t xml:space="preserve"> </w:t>
-      </w:r>
-      <w:proofErr w:type="spellStart"/>
-      <w:r>
-        <w:t>iam</w:t>
-      </w:r>
-      <w:proofErr w:type="spellEnd"/>
-      <w:r>
-        <w:t xml:space="preserve"> create-user --user-name Alice</w:t>
+      <w:r>
+        <w:t>aws iam create-user --user-name Alice</w:t>
       </w:r>
     </w:p>
     <w:p>
@@ -2149,49 +1883,13 @@
       </w:r>
     </w:p>
     <w:p>
-      <w:proofErr w:type="spellStart"/>
-      <w:r>
-        <w:t>iam</w:t>
-      </w:r>
-      <w:proofErr w:type="spellEnd"/>
-      <w:r>
-        <w:t xml:space="preserve"> = boto3.client('</w:t>
-      </w:r>
-      <w:proofErr w:type="spellStart"/>
-      <w:r>
-        <w:t>iam</w:t>
-      </w:r>
-      <w:proofErr w:type="spellEnd"/>
-      <w:r>
-        <w:t>')</w:t>
-      </w:r>
-    </w:p>
-    <w:p>
-      <w:proofErr w:type="spellStart"/>
-      <w:proofErr w:type="gramStart"/>
-      <w:r>
-        <w:t>iam.create</w:t>
-      </w:r>
-      <w:proofErr w:type="gramEnd"/>
-      <w:r>
-        <w:t>_</w:t>
-      </w:r>
-      <w:proofErr w:type="gramStart"/>
-      <w:r>
-        <w:t>user</w:t>
-      </w:r>
-      <w:proofErr w:type="spellEnd"/>
-      <w:r>
-        <w:t>(</w:t>
-      </w:r>
-      <w:proofErr w:type="spellStart"/>
-      <w:proofErr w:type="gramEnd"/>
-      <w:r>
-        <w:t>UserName</w:t>
-      </w:r>
-      <w:proofErr w:type="spellEnd"/>
-      <w:r>
-        <w:t>='Alice')</w:t>
+      <w:r>
+        <w:t>iam = boto3.client('iam')</w:t>
+      </w:r>
+    </w:p>
+    <w:p>
+      <w:r>
+        <w:t>iam.create_user(UserName='Alice')</w:t>
       </w:r>
     </w:p>
     <w:p>

</xml_diff>